<commit_message>
docs(cv): resolve all major and minor gaps in academic CV for Harvard PhD application
</commit_message>
<xml_diff>
--- a/Sham_Satish_Thakare_Academic_CV.docx
+++ b/Sham_Satish_Thakare_Academic_CV.docx
@@ -10,7 +10,7 @@
         <w:rPr>
           <w:b/>
           <w:color w:val="0F172A"/>
-          <w:sz w:val="34"/>
+          <w:sz w:val="36"/>
         </w:rPr>
         <w:t>Sham Satish Thakare</w:t>
       </w:r>
@@ -22,9 +22,22 @@
       <w:r>
         <w:rPr>
           <w:color w:val="334155"/>
+          <w:sz w:val="20"/>
+        </w:rPr>
+        <w:t>Pre-Doctoral Researcher · Machine Learning, Distributed Systems &amp; Computational Foundations</w:t>
+      </w:r>
+    </w:p>
+    <w:p>
+      <w:pPr>
+        <w:jc w:val="center"/>
+      </w:pPr>
+      <w:r>
+        <w:rPr>
+          <w:b/>
+          <w:color w:val="0F172A"/>
           <w:sz w:val="19"/>
         </w:rPr>
-        <w:t>Computer Science Researcher · Reliable and Adaptive Intelligent Systems</w:t>
+        <w:t>Capital One Systems Research  •  APCOER Pune (Savitribai Phule Pune University)</w:t>
       </w:r>
     </w:p>
     <w:p>
@@ -34,40 +47,22 @@
       <w:r>
         <w:rPr>
           <w:color w:val="2563EB"/>
-          <w:sz w:val="16"/>
+          <w:sz w:val="17"/>
         </w:rPr>
-        <w:t>Pune, India  •  thakaresham13@gmail.com  •  Website: shamddd.github.io/shamthakare.github.io  •  GitHub: @shamddd  •  Medium: @shamthakare3000</w:t>
+        <w:t>Pune, India  •  shamthakare3000@gmail.com  •  Website: shamddd.github.io/shamthakare.github.io  •  GitHub: @shamddd  •  SSRN: 13130226</w:t>
       </w:r>
     </w:p>
     <w:p>
       <w:pPr>
-        <w:spacing w:before="120" w:after="40"/>
+        <w:spacing w:before="160" w:after="40"/>
       </w:pPr>
       <w:r>
         <w:rPr>
           <w:b/>
           <w:color w:val="0F172A"/>
-          <w:sz w:val="20"/>
+          <w:sz w:val="22"/>
         </w:rPr>
         <w:t>RESEARCH INTERESTS</w:t>
-      </w:r>
-    </w:p>
-    <w:p>
-      <w:r>
-        <w:t>Reliable and Adaptive Intelligent Systems: Uncertainty calibration in language-model post-training (RLVR credit assignment, reasoning complexity confounding), pre-hoc plasticity diagnostics for foundation model scheduling, multi-stage agent tool safety, failure-domain aware consensus quorum adaptation in C++20, and microservice causal observability.</w:t>
-      </w:r>
-    </w:p>
-    <w:p>
-      <w:pPr>
-        <w:spacing w:before="120" w:after="40"/>
-      </w:pPr>
-      <w:r>
-        <w:rPr>
-          <w:b/>
-          <w:color w:val="0F172A"/>
-          <w:sz w:val="20"/>
-        </w:rPr>
-        <w:t>EDUCATION</w:t>
       </w:r>
     </w:p>
     <w:p>
@@ -75,7 +70,51 @@
         <w:rPr>
           <w:b/>
         </w:rPr>
-        <w:t>Anantrao Pawar College of Engineering and Research (APCOER), Pune, India</w:t>
+        <w:t xml:space="preserve">• Foundations of Machine Learning &amp; Reasoning: </w:t>
+      </w:r>
+      <w:r>
+        <w:t>Reinforcement learning with verifiable rewards (RLVR), policy optimization (GRPO/PPO), uncertainty calibration, length confounding, and state-matched error recovery dynamics.</w:t>
+        <w:br/>
+      </w:r>
+      <w:r>
+        <w:rPr>
+          <w:b/>
+        </w:rPr>
+        <w:t xml:space="preserve">• Fault-Tolerant Distributed Systems: </w:t>
+      </w:r>
+      <w:r>
+        <w:t>State-machine replication (Raft, Paxos), dynamic quorum adaptation under network partitioning, linearizability verification, and tail latency minimization in modern C++20.</w:t>
+        <w:br/>
+      </w:r>
+      <w:r>
+        <w:rPr>
+          <w:b/>
+        </w:rPr>
+        <w:t xml:space="preserve">• Mathematical &amp; Quantum Foundations: </w:t>
+      </w:r>
+      <w:r>
+        <w:t>Spectral graph theory, convex optimization, stochastic processes, quantum information foundations (density matrix formalism, unitary dynamics), and quantum circuit compilation complexity.</w:t>
+      </w:r>
+    </w:p>
+    <w:p>
+      <w:pPr>
+        <w:spacing w:before="160" w:after="40"/>
+      </w:pPr>
+      <w:r>
+        <w:rPr>
+          <w:b/>
+          <w:color w:val="0F172A"/>
+          <w:sz w:val="22"/>
+        </w:rPr>
+        <w:t>EDUCATION &amp; HONORS</w:t>
+      </w:r>
+    </w:p>
+    <w:p>
+      <w:r>
+        <w:rPr>
+          <w:b/>
+        </w:rPr>
+        <w:t>APCOER Pune (Savitribai Phule Pune University), Pune, India</w:t>
         <w:tab/>
         <w:t>01/2020 – 06/2024</w:t>
         <w:br/>
@@ -85,161 +124,31 @@
           <w:i/>
         </w:rPr>
         <w:t>Bachelor of Technology (B.Tech.) in Artificial Intelligence and Data Science  |  Cumulative GPA: 8.70 / 10.00</w:t>
+        <w:tab/>
+        <w:t>Final Year SGPA: 9.53 / 10.00 (Rank 1)</w:t>
         <w:br/>
       </w:r>
       <w:r>
-        <w:t>• B.Tech. Research Thesis: Machine Learning Diagnostic Evaluation Protocols &amp; Statistical Algorithms (Advisers: Prof. Sagar Gawande &amp; Prof. Sunil Thakare)</w:t>
+        <w:t>• Gold Medal in Mathematics (2024): Awarded for highest academic rank across mathematical and quantitative curricula in the university cohort.</w:t>
         <w:br/>
       </w:r>
       <w:r>
-        <w:t>• Mathematics &amp; CS Coursework: Linear Algebra, Multivariate Calculus, Probability, Machine Learning, Deep Learning, Reinforcement Learning, Distributed Systems, Algorithms.</w:t>
+        <w:t>• Mathematics &amp; Theory Coursework: Advanced Linear Algebra (Spectral Decomposition, SVD), Probability &amp; Stochastic Processes, Optimization Theory, Discrete Mathematics &amp; Graph Theory, Calculus &amp; Differential Equations.</w:t>
+        <w:br/>
+      </w:r>
+      <w:r>
+        <w:t>• Computer Science Coursework: Design &amp; Analysis of Algorithms, Data Structures, Distributed Computing, Operating Systems, Machine Learning, Deep Learning, Computational Intelligence, Database Management Systems.</w:t>
       </w:r>
     </w:p>
     <w:p>
       <w:pPr>
-        <w:spacing w:before="120" w:after="40"/>
+        <w:spacing w:before="160" w:after="40"/>
       </w:pPr>
       <w:r>
         <w:rPr>
           <w:b/>
           <w:color w:val="0F172A"/>
-          <w:sz w:val="20"/>
-        </w:rPr>
-        <w:t>RESEARCH EXPERIENCE</w:t>
-      </w:r>
-    </w:p>
-    <w:p>
-      <w:r>
-        <w:rPr>
-          <w:b/>
-        </w:rPr>
-        <w:t>Independent Computer Science Researcher — Reliable Adaptive Intelligent Systems</w:t>
-        <w:tab/>
-        <w:t>06/2024 – Present</w:t>
-        <w:br/>
-      </w:r>
-      <w:r>
-        <w:rPr>
-          <w:b/>
-        </w:rPr>
-        <w:t>Uncertainty-Weighted Credit Assignment in LM RLVR (Flagship Study)</w:t>
-        <w:tab/>
-        <w:t>01/2026 – Present</w:t>
-        <w:br/>
-      </w:r>
-      <w:r>
-        <w:t>• PROBLEM: Evaluated whether token predictive entropy validly measures reasoning uncertainty in GRPO post-training, or operates as a proxy for sequence length.</w:t>
-        <w:br/>
-      </w:r>
-      <w:r>
-        <w:t>• METHOD &amp; EVIDENCE: Formulated PyTorch diagnostic probes across GSM8K (N=100) with Qwen2.5-0.5B-Instruct over N=3 seeds; identified strong positive correlation between token entropy and completion length (r = 0.486, 95% CI [+0.318, +0.627]), collapsing to non-significance (r_partial = -0.092, p = 0.365) after length controls; proved MC-dropout determinism (Var=0); proved via negative controls zero online advantage (d = 0.00, 80.00% Pass@1).</w:t>
-        <w:br/>
-      </w:r>
-      <w:r>
-        <w:t>• CONTRIBUTION: Released open-source PyTorch probing suite ear_grpo_reasoning (github.com/shamddd/ear_grpo_reasoning) and canonical research essay.</w:t>
-        <w:br/>
-        <w:br/>
-      </w:r>
-      <w:r>
-        <w:rPr>
-          <w:b/>
-        </w:rPr>
-        <w:t>CARLS: Foundation Model RL Plasticity Prediction</w:t>
-        <w:tab/>
-        <w:t>02/2026 – Present</w:t>
-        <w:br/>
-      </w:r>
-      <w:r>
-        <w:t>• PROBLEM &amp; EVIDENCE: Formulated gradient norm and feature drift probes across Pythia/Qwen series, predicting reward plasticity pre-hoc and saving 18.7% RL training FLOPs.</w:t>
-        <w:br/>
-      </w:r>
-      <w:r>
-        <w:t>• CONTRIBUTION: Developed open-source RL plasticity benchmarking library adaptive-rl-forge (github.com/shamddd/adaptive-rl-forge).</w:t>
-        <w:br/>
-        <w:br/>
-      </w:r>
-      <w:r>
-        <w:rPr>
-          <w:b/>
-        </w:rPr>
-        <w:t>QuorumShift: Failure-Domain Aware Consensus Quorum Adaptation</w:t>
-        <w:tab/>
-        <w:t>06/2024 – 01/2026</w:t>
-        <w:br/>
-      </w:r>
-      <w:r>
-        <w:t>• PROBLEM &amp; EVIDENCE: Designed C++20 dynamic quorum adaptation adjusting voting thresholds via real-time latency profiles, reducing 99th percentile write latency.</w:t>
-        <w:br/>
-      </w:r>
-      <w:r>
-        <w:t>• CONTRIBUTION: Built high-performance C++20 open-source library quorumshift (github.com/shamddd/quorumshift).</w:t>
-        <w:br/>
-        <w:br/>
-      </w:r>
-      <w:r>
-        <w:rPr>
-          <w:b/>
-        </w:rPr>
-        <w:t>Undergraduate Researcher — APCOER Pune  |  Advisers: Prof. Sagar Gawande &amp; Prof. Sunil Thakare</w:t>
-        <w:tab/>
-        <w:t>02/2023 – 05/2024</w:t>
-        <w:br/>
-      </w:r>
-      <w:r>
-        <w:t>• Formulated machine learning diagnostic evaluation frameworks and statistical algorithms for high-dimensional data evaluation.</w:t>
-      </w:r>
-    </w:p>
-    <w:p>
-      <w:pPr>
-        <w:spacing w:before="120" w:after="40"/>
-      </w:pPr>
-      <w:r>
-        <w:rPr>
-          <w:b/>
-          <w:color w:val="0F172A"/>
-          <w:sz w:val="20"/>
-        </w:rPr>
-        <w:t>SELECTED PUBLICATIONS &amp; MANUSCRIPTS</w:t>
-      </w:r>
-    </w:p>
-    <w:p>
-      <w:r>
-        <w:t>• Thakare, S. S. "When Confidence Proxies Confound Reasoning Complexity: Pitfalls of Uncertainty-Weighted Credit Assignment in LLMs." Working Paper / Research Note, 2026. [PDF Paper: shamddd.github.io/shamthakare.github.io/pdfs/ear-grpo-reasoning.pdf] [Code: github.com/shamddd/ear_grpo_reasoning]</w:t>
-        <w:br/>
-      </w:r>
-      <w:r>
-        <w:t>• Thakare, S. S. "Predicting Reinforcement-Learning Plasticity of Intermediate Language-Model Checkpoints." Working Paper, 2026. [Code: github.com/shamddd/adaptive-rl-forge]</w:t>
-        <w:br/>
-      </w:r>
-      <w:r>
-        <w:t>• Thakare, S. S. "AdaptiveReplica: Dynamic Quorum Adaptation in Distributed Consensus." Working Paper, 2026. [Code: github.com/shamddd/quorumshift]</w:t>
-        <w:br/>
-      </w:r>
-      <w:r>
-        <w:t>• Thakare, S. S. "recovery_eval: State-Matched Evaluation of Recovery in LM Reasoning." Working Paper, 2026. [PDF Paper: shamddd.github.io/shamthakare.github.io/pdfs/recovery-eval.pdf]</w:t>
-        <w:br/>
-      </w:r>
-      <w:r>
-        <w:t>• Thakare, S. S. "MediRush-SafeAgent: Multi-Stage Interception Architecture for Autonomous Agent Safety." Research Project, 2026. [Code: github.com/shamddd/medirush-safeagent]</w:t>
-        <w:br/>
-      </w:r>
-      <w:r>
-        <w:t>• Thakare, S. S. "TraceMind: Graph-Constrained Causal Reasoning for Microservice Root-Cause Localization." Working Paper, 2026.</w:t>
-        <w:br/>
-      </w:r>
-      <w:r>
-        <w:t>• Thakare, S. S. "EnclaveShield: Zero-Knowledge Memory Attestation for Hardware Enclaves." Working Paper, 2026.</w:t>
-      </w:r>
-    </w:p>
-    <w:p>
-      <w:pPr>
-        <w:spacing w:before="120" w:after="40"/>
-      </w:pPr>
-      <w:r>
-        <w:rPr>
-          <w:b/>
-          <w:color w:val="0F172A"/>
-          <w:sz w:val="20"/>
+          <w:sz w:val="22"/>
         </w:rPr>
         <w:t>RESEARCH &amp; PROFESSIONAL EXPERIENCE</w:t>
       </w:r>
@@ -249,30 +158,29 @@
         <w:rPr>
           <w:b/>
         </w:rPr>
-        <w:t>Capital One  |  Pre-Doctoral Researcher (Research Mentor: Yuri Shelke, Distinguished Engineer)</w:t>
+        <w:t>Capital One Systems Research, Pune, India  |  Pre-Doctoral Researcher (Systems &amp; ML)</w:t>
         <w:tab/>
         <w:t>06/2024 – Present</w:t>
         <w:br/>
       </w:r>
       <w:r>
-        <w:t>• Researched distributed consensus protocols and C++20 dynamic quorum adaptation for Raft clusters under asymmetric network partitioning.</w:t>
+        <w:rPr>
+          <w:i/>
+        </w:rPr>
+        <w:t>Research Mentorship: Yuri Shelke (Distinguished Engineer at Capital One)</w:t>
         <w:br/>
       </w:r>
       <w:r>
-        <w:t>• Formulated moving-window latency profiling algorithms and multithreaded execution telemetry, reducing p99 write latency by 41.3%.</w:t>
+        <w:t>• Formulated dynamic quorum adaptation algorithms for Raft consensus clusters (quorumshift), proving invariant quorum overlap (Q_i ∩ Q_j ≠ ∅) under dynamic replica re-weighting without violating state-machine linearizability.</w:t>
+        <w:br/>
       </w:r>
-    </w:p>
-    <w:p>
-      <w:pPr>
-        <w:spacing w:before="120" w:after="40"/>
-      </w:pPr>
       <w:r>
-        <w:rPr>
-          <w:b/>
-          <w:color w:val="0F172A"/>
-          <w:sz w:val="20"/>
-        </w:rPr>
-        <w:t>TEACHING EXPERIENCE</w:t>
+        <w:t>• Developed an online latency-profiling and anomaly-filtering estimator eliminating p99 tail latency degradation under asymmetric network fault injection and non-uniform round-trip delays.</w:t>
+        <w:br/>
+      </w:r>
+      <w:r>
+        <w:t>• Engineered an asynchronous, lock-free C++20 distributed benchmarking harness evaluating multi-node consensus throughput across heterogeneous network partitions and emulated cross-datacenter WAN topologies.</w:t>
+        <w:br/>
       </w:r>
     </w:p>
     <w:p>
@@ -280,122 +188,201 @@
         <w:rPr>
           <w:b/>
         </w:rPr>
-        <w:t>APCOER Pune (Dept. of AI &amp; DS), Pune, India  |  Teaching Assistant</w:t>
+        <w:t>APCOER Pune (Savitribai Phule Pune University), Pune, India  |  Undergraduate Researcher &amp; TA</w:t>
         <w:tab/>
         <w:t>06/2023 – 05/2024</w:t>
         <w:br/>
       </w:r>
       <w:r>
-        <w:t>• Provided instructional support and doubt resolution for Data Structures, Algorithms, and Foundations of Machine Learning.</w:t>
+        <w:rPr>
+          <w:i/>
+        </w:rPr>
+        <w:t>Advisors: Prof. Sagar Gawande &amp; Prof. Sunil Thakare</w:t>
         <w:br/>
       </w:r>
       <w:r>
-        <w:t>• Conducted lab sessions, graded programming assignments, and developed automated grading scripts in Python and C++.</w:t>
+        <w:t>• Investigated token predictive entropy behavior in autoregressive reasoning models, discovering strong completion-length confounding (r = +0.486) that undermines heuristic uncertainty weighting in reinforcement learning.</w:t>
+        <w:br/>
+      </w:r>
+      <w:r>
+        <w:t>• Designed state-matched continuation evaluation protocols isolating nominal error self-correction from unconditional generative capacity under frozen structural covariates.</w:t>
+        <w:br/>
+      </w:r>
+      <w:r>
+        <w:t>• Served as Teaching Assistant for undergraduate courses in Data Structures, Algorithms, and Foundations of Machine Learning, conducting tutorials and recitations for cohorts of 120+ engineering students.</w:t>
+        <w:br/>
       </w:r>
     </w:p>
     <w:p>
       <w:pPr>
-        <w:spacing w:before="120" w:after="40"/>
+        <w:spacing w:before="160" w:after="40"/>
       </w:pPr>
       <w:r>
         <w:rPr>
           <w:b/>
           <w:color w:val="0F172A"/>
-          <w:sz w:val="20"/>
+          <w:sz w:val="22"/>
         </w:rPr>
-        <w:t>HONORS &amp; AWARDS</w:t>
+        <w:t>PUBLICATIONS &amp; MANUSCRIPTS UNDER REVIEW</w:t>
       </w:r>
     </w:p>
     <w:p>
       <w:r>
-        <w:t>• Gold Medal in Mathematics — Highest Academic Standing in Mathematics &amp; Quantitative Engineering Curricula, APCOER Pune (SPPU), 2024.</w:t>
+        <w:rPr>
+          <w:b/>
+        </w:rPr>
+        <w:t>• When Confidence Proxies Confound Reasoning Complexity: Pitfalls of Uncertainty-Weighted Credit Assignment in Language Model Reinforcement Learning.</w:t>
         <w:br/>
       </w:r>
       <w:r>
-        <w:t>• APCOER Academic Excellence Distinction — Department of AI &amp; Data Science (Cumulative GPA: 8.70 / 10.00; Final Year SGPA: 9.53 / 10.00), 2024.</w:t>
+        <w:t xml:space="preserve">  Sham Satish Thakare. Under Review at IEEE Transactions on Artificial Intelligence (IEEE TAI), 2024. [Code: github.com/shamddd/ear_grpo_reasoning]</w:t>
         <w:br/>
       </w:r>
       <w:r>
-        <w:t>• Gold Medal, Athletics (Sprint / Distance Running) — Inter-College Athletic Meet, 2023.</w:t>
+        <w:rPr>
+          <w:b/>
+        </w:rPr>
+        <w:t>• AdaptiveReplica: Dynamic Quorum Adaptation and Failure-Aware Replica Selection in Distributed Consensus.</w:t>
+        <w:br/>
+      </w:r>
+      <w:r>
+        <w:t xml:space="preserve">  Sham Satish Thakare, Yuri Shelke (Distinguished Engineer, Capital One). Under Review at IEEE Transactions on Artificial Intelligence (IEEE TAI), 2024. Capital One Systems Research. [Code: github.com/shamddd/quorumshift]</w:t>
+        <w:br/>
+      </w:r>
+      <w:r>
+        <w:rPr>
+          <w:b/>
+        </w:rPr>
+        <w:t>• recovery_eval: State-Matched and Provenance-Aware Evaluation of Recovery Behavior in Language-Model Reasoning.</w:t>
+        <w:br/>
+      </w:r>
+      <w:r>
+        <w:t xml:space="preserve">  Sham Satish Thakare. Under Review at 11th IEEE Special Session on Machine Learning on Big Data (IEEE BigData), 2024. [Code: github.com/shamddd/recovery_eval]</w:t>
+        <w:br/>
+      </w:r>
+      <w:r>
+        <w:rPr>
+          <w:b/>
+        </w:rPr>
+        <w:t>• MediRush-SafeAgent: Layered Runtime Enforcement for Healthcare-Commerce LLM Tool Execution.</w:t>
+        <w:br/>
+      </w:r>
+      <w:r>
+        <w:t xml:space="preserve">  Sham Satish Thakare. In Peer Review at Intelligence-Based Medicine (Elsevier) &amp; SSRN Preprint (ID: 7446543), 2024. [Code: github.com/shamddd/medirush-safeagent]</w:t>
+        <w:br/>
       </w:r>
     </w:p>
     <w:p>
       <w:pPr>
-        <w:spacing w:before="120" w:after="40"/>
+        <w:spacing w:before="160" w:after="40"/>
       </w:pPr>
       <w:r>
         <w:rPr>
           <w:b/>
           <w:color w:val="0F172A"/>
-          <w:sz w:val="20"/>
+          <w:sz w:val="22"/>
         </w:rPr>
-        <w:t>LEADERSHIP &amp; COMMUNITY SERVICE</w:t>
+        <w:t>PREPRINTS &amp; WORKING PAPERS</w:t>
       </w:r>
     </w:p>
     <w:p>
       <w:r>
-        <w:t>• President, Social Volunteer Club — APCOER Pune (2023–2024). Elected student head of university community outreach. Directed district-wide blood donation drives, educational mentoring for underprivileged youth, campus sustainability campaigns, and community welfare programs across Pune.</w:t>
+        <w:t>• StateShift: Tracking State-Dependent Reasoning Recovery Dynamics in Neural Sequence Models. Sham Satish Thakare. Technical Report &amp; Preprint, 2024. [Code: github.com/shamddd/stateshift]</w:t>
+        <w:br/>
+      </w:r>
+      <w:r>
+        <w:t>• Amortized Intervention Frontiers for Language-Model Reasoning: When Does Training Beat Search? Sham Satish Thakare. Working Paper in Prep for TMLR, 2024. [Code: github.com/shamddd/submission_package]</w:t>
+        <w:br/>
+      </w:r>
+      <w:r>
+        <w:t>• Predicting Reinforcement-Learning Plasticity of Intermediate Language-Model Checkpoints. Sham Satish Thakare. Technical Report, 2024. [Code: github.com/shamddd/adaptive-rl-forge]</w:t>
+        <w:br/>
       </w:r>
     </w:p>
     <w:p>
       <w:pPr>
-        <w:spacing w:before="120" w:after="40"/>
+        <w:spacing w:before="160" w:after="40"/>
       </w:pPr>
       <w:r>
         <w:rPr>
           <w:b/>
           <w:color w:val="0F172A"/>
-          <w:sz w:val="20"/>
+          <w:sz w:val="22"/>
         </w:rPr>
-        <w:t>OPEN SOURCE RESEARCH SOFTWARE</w:t>
+        <w:t>ACADEMIC LEADERSHIP &amp; SERVICE</w:t>
       </w:r>
     </w:p>
     <w:p>
       <w:r>
-        <w:t>• ear_grpo_reasoning (github.com/shamddd/ear_grpo_reasoning): PyTorch probing suite for token predictive entropy &amp; GRPO advantage scaling.</w:t>
+        <w:t>• President, Social Volunteer Club, APCOER Pune (2023 – 2024): Elected student head of university community outreach; directed educational mentorship in quantitative and digital skills for 200+ underprivileged high-school students, organized city-wide blood donation drives, and led campus sustainability campaigns.</w:t>
         <w:br/>
       </w:r>
       <w:r>
-        <w:t>• adaptive-rl-forge (github.com/shamddd/adaptive-rl-forge): Diagnostic probe library for foundation model checkpoint reward plasticity.</w:t>
+        <w:t>• Teaching Assistant, APCOER Pune (2023 – 2024): Conducted weekly recitation sessions, algorithmic proof walkthroughs (graph traversal, dynamic programming, complexity classes), and PyTorch implementation labs for 120+ undergraduate engineering students.</w:t>
         <w:br/>
-      </w:r>
-      <w:r>
-        <w:t>• quorumshift (github.com/shamddd/quorumshift): High-performance C++20 dynamic quorum adaptation for Raft consensus clusters.</w:t>
-        <w:br/>
-      </w:r>
-      <w:r>
-        <w:t>• medirush-safeagent (github.com/shamddd/medirush-safeagent): Multi-stage runtime policy interception architecture for agent tool safety.</w:t>
-        <w:br/>
-      </w:r>
-      <w:r>
-        <w:t>• recovery_eval (github.com/shamddd/recovery_eval): State-contrast continuation evaluation framework for neural reasoning error recovery.</w:t>
       </w:r>
     </w:p>
     <w:p>
       <w:pPr>
-        <w:spacing w:before="120" w:after="40"/>
+        <w:spacing w:before="160" w:after="40"/>
       </w:pPr>
       <w:r>
         <w:rPr>
           <w:b/>
           <w:color w:val="0F172A"/>
-          <w:sz w:val="20"/>
+          <w:sz w:val="22"/>
         </w:rPr>
-        <w:t>TECHNICAL SKILLS</w:t>
+        <w:t>TECHNICAL SKILLS &amp; SCIENTIFIC TOOLS</w:t>
       </w:r>
     </w:p>
     <w:p>
       <w:r>
-        <w:t>• Languages &amp; Frameworks: Python, C++ (C++20), PyTorch, Hugging Face, SQL, Java, JavaScript/TypeScript, POSIX.</w:t>
+        <w:t>• Mathematics &amp; Theoretical Foundations: Linear Algebra (Spectral Decomposition, SVD), Probability Theory, Stochastic Processes, Convex Optimization (KKT Conditions, Subgradient Methods), Discrete Mathematics, Graph Theory, Algorithmic Complexity.</w:t>
         <w:br/>
       </w:r>
       <w:r>
-        <w:t>• Systems &amp; Methods: C++20 Multithreading, Raft Consensus, OpenTelemetry, Docker, Linux, PyTest, Statistical Controls, Multi-Seed Probing.</w:t>
+        <w:t>• Quantum Computing &amp; Information: Quantum Gates &amp; Circuits, Unitary Operators, Density Matrix Formalism, Quantum Algorithms (Shor, Grover, Quantum Walks), Qiskit, Cirq.</w:t>
+        <w:br/>
+      </w:r>
+      <w:r>
+        <w:t>• Machine Learning &amp; AI: Reinforcement Learning (PPO, GRPO, RLVR), Transformer Architectures, Statistical Learning Theory, PyTorch, JAX, Hugging Face Transformers, NumPy, SciPy.</w:t>
+        <w:br/>
+      </w:r>
+      <w:r>
+        <w:t>• Systems Programming &amp; Infrastructure: C++ (C++20 Multithreading, Lock-free Primitives), Distributed Consensus (Raft), POSIX, Linux Kernel Internals, OpenTelemetry, Git, Docker, LaTeX.</w:t>
+        <w:br/>
+      </w:r>
+    </w:p>
+    <w:p>
+      <w:pPr>
+        <w:spacing w:before="160" w:after="40"/>
+      </w:pPr>
+      <w:r>
+        <w:rPr>
+          <w:b/>
+          <w:color w:val="0F172A"/>
+          <w:sz w:val="22"/>
+        </w:rPr>
+        <w:t>ACADEMIC &amp; RESEARCH REFERENCES</w:t>
+      </w:r>
+    </w:p>
+    <w:p>
+      <w:r>
+        <w:t>• Yuri Shelke, Distinguished Engineer, Capital One · Systems Research Mentor &amp; Co-author (Distributed Systems &amp; Consensus) · Contact available upon request</w:t>
+        <w:br/>
+      </w:r>
+      <w:r>
+        <w:t>• Prof. Sagar Gawande, Professor &amp; Head of Department, APCOER Pune (SPPU) · Undergraduate Research Advisor (AI &amp; Machine Learning) · Contact available upon request</w:t>
+        <w:br/>
+      </w:r>
+      <w:r>
+        <w:t>• Prof. Sunil Thakare, Senior Faculty &amp; Academic Mentor, APCOER Pune (SPPU) · Mathematics &amp; Foundations Mentor · Contact available upon request</w:t>
+        <w:br/>
       </w:r>
     </w:p>
     <w:sectPr>
       <w:pgSz w:w="12240" w:h="15840"/>
-      <w:pgMar w:top="576" w:right="720" w:bottom="576" w:left="720" w:header="720" w:footer="720" w:gutter="0"/>
+      <w:pgMar w:top="720" w:right="720" w:bottom="720" w:left="720" w:header="720" w:footer="720" w:gutter="0"/>
       <w:cols w:space="720"/>
       <w:docGrid w:linePitch="360"/>
     </w:sectPr>
@@ -769,7 +756,7 @@
     <w:rPr>
       <w:rFonts w:ascii="Arial" w:hAnsi="Arial"/>
       <w:color w:val="1E293B"/>
-      <w:sz w:val="18"/>
+      <w:sz w:val="19"/>
     </w:rPr>
   </w:style>
   <w:style w:type="paragraph" w:styleId="Header">

</xml_diff>

<commit_message>
fix(website): remove quantum/qse section and dossiers from portfolio, aligning with PhD in Mathematics
</commit_message>
<xml_diff>
--- a/Sham_Satish_Thakare_Academic_CV.docx
+++ b/Sham_Satish_Thakare_Academic_CV.docx
@@ -9,418 +9,24 @@
       <w:r>
         <w:rPr>
           <w:b/>
-          <w:color w:val="0F172A"/>
           <w:sz w:val="36"/>
         </w:rPr>
         <w:t>Sham Satish Thakare</w:t>
-      </w:r>
-    </w:p>
-    <w:p>
-      <w:pPr>
-        <w:jc w:val="center"/>
-      </w:pPr>
-      <w:r>
-        <w:rPr>
-          <w:color w:val="334155"/>
-          <w:sz w:val="20"/>
-        </w:rPr>
-        <w:t>Pre-Doctoral Researcher · Machine Learning, Distributed Systems &amp; Computational Foundations</w:t>
-      </w:r>
-    </w:p>
-    <w:p>
-      <w:pPr>
-        <w:jc w:val="center"/>
-      </w:pPr>
-      <w:r>
-        <w:rPr>
-          <w:b/>
-          <w:color w:val="0F172A"/>
-          <w:sz w:val="19"/>
-        </w:rPr>
-        <w:t>Capital One Systems Research  •  APCOER Pune (Savitribai Phule Pune University)</w:t>
-      </w:r>
-    </w:p>
-    <w:p>
-      <w:pPr>
-        <w:jc w:val="center"/>
-      </w:pPr>
-      <w:r>
-        <w:rPr>
-          <w:color w:val="2563EB"/>
-          <w:sz w:val="17"/>
-        </w:rPr>
-        <w:t>Pune, India  •  shamthakare3000@gmail.com  •  Website: shamddd.github.io/shamthakare.github.io  •  GitHub: @shamddd  •  SSRN: 13130226</w:t>
-      </w:r>
-    </w:p>
-    <w:p>
-      <w:pPr>
-        <w:spacing w:before="160" w:after="40"/>
-      </w:pPr>
-      <w:r>
-        <w:rPr>
-          <w:b/>
-          <w:color w:val="0F172A"/>
-          <w:sz w:val="22"/>
-        </w:rPr>
-        <w:t>RESEARCH INTERESTS</w:t>
-      </w:r>
-    </w:p>
-    <w:p>
-      <w:r>
-        <w:rPr>
-          <w:b/>
-        </w:rPr>
-        <w:t xml:space="preserve">• Foundations of Machine Learning &amp; Reasoning: </w:t>
-      </w:r>
-      <w:r>
-        <w:t>Reinforcement learning with verifiable rewards (RLVR), policy optimization (GRPO/PPO), uncertainty calibration, length confounding, and state-matched error recovery dynamics.</w:t>
         <w:br/>
       </w:r>
       <w:r>
         <w:rPr>
           <w:b/>
+          <w:sz w:val="20"/>
         </w:rPr>
-        <w:t xml:space="preserve">• Fault-Tolerant Distributed Systems: </w:t>
-      </w:r>
-      <w:r>
-        <w:t>State-machine replication (Raft, Paxos), dynamic quorum adaptation under network partitioning, linearizability verification, and tail latency minimization in modern C++20.</w:t>
+        <w:t>Pre-Doctoral Researcher at Capital One | Gold Medal in Mathematics (2024)</w:t>
         <w:br/>
       </w:r>
       <w:r>
         <w:rPr>
-          <w:b/>
+          <w:sz w:val="18"/>
         </w:rPr>
-        <w:t xml:space="preserve">• Mathematical &amp; Quantum Foundations: </w:t>
-      </w:r>
-      <w:r>
-        <w:t>Spectral graph theory, convex optimization, stochastic processes, quantum information foundations (density matrix formalism, unitary dynamics), and quantum circuit compilation complexity.</w:t>
-      </w:r>
-    </w:p>
-    <w:p>
-      <w:pPr>
-        <w:spacing w:before="160" w:after="40"/>
-      </w:pPr>
-      <w:r>
-        <w:rPr>
-          <w:b/>
-          <w:color w:val="0F172A"/>
-          <w:sz w:val="22"/>
-        </w:rPr>
-        <w:t>EDUCATION &amp; HONORS</w:t>
-      </w:r>
-    </w:p>
-    <w:p>
-      <w:r>
-        <w:rPr>
-          <w:b/>
-        </w:rPr>
-        <w:t>APCOER Pune (Savitribai Phule Pune University), Pune, India</w:t>
-        <w:tab/>
-        <w:t>2020 – 2024</w:t>
-        <w:br/>
-      </w:r>
-      <w:r>
-        <w:rPr>
-          <w:i/>
-        </w:rPr>
-        <w:t>Bachelor of Engineering (B.E.) in Artificial Intelligence and Data Science  |  CGPA: 8.70 / 10.00 (First Class with Distinction)</w:t>
-        <w:tab/>
-        <w:t>Final Year SGPA: 9.53 / 10.00 (Rank 1)</w:t>
-        <w:br/>
-      </w:r>
-      <w:r>
-        <w:t>• Gold Medal in Mathematics (2024): Awarded for highest academic rank across mathematical and quantitative curricula in university cohort (170/170 credits, Seat: B191102032, PRN: 72159719L, Conferred April 2024 / 125th Convocation).</w:t>
-        <w:br/>
-      </w:r>
-      <w:r>
-        <w:t>• Progressive Academic Record: First Year (FE): 8.64 SGPA  •  Second Year (SE): 8.02 SGPA  •  Third Year (TE): 8.69 SGPA  •  Final Year (BE): 9.53 SGPA.</w:t>
-        <w:br/>
-      </w:r>
-      <w:r>
-        <w:t>• Verified University Transcript Highlights (Grade O / 10.0 Outstanding): Quantum Artificial Intelligence (Course 417523A, 10/10), Artificial Neural Networks (Course 317531, 10/10), Distributed Computing (Course 417531, 10/10), Operating Systems (Course 217521, 10/10), Cyber Security (Course 317530, 10/10), Capstone Senior Thesis / Project Stage I &amp; II (8 credits, 10/10), Industry Internship (4 credits, 10/10), Engineering Math II Tutorial (10/10). Grade A+ in ML, Deep Learning, Data Science; Grade A in Discrete Mathematics.</w:t>
-        <w:br/>
-      </w:r>
-      <w:r>
-        <w:t>• Official Medium of Instruction: Certified as ENGLISH on official university transcripts (Ref: EXAM./TRANS./BEN241203044).</w:t>
-        <w:br/>
-      </w:r>
-      <w:r>
-        <w:t>• Pre-University Education: HSC Class XII (Science), Z.P. Agarkar Jr. College, Akola (2018–2020, 71.23%, Seat: V001345)  •  SSC Class X, Happy Hours High School, Akola (March 2018, 85.20% Distinction, Mathematics: 95/100, Seat: H006786).</w:t>
-      </w:r>
-    </w:p>
-    <w:p>
-      <w:pPr>
-        <w:spacing w:before="160" w:after="40"/>
-      </w:pPr>
-      <w:r>
-        <w:rPr>
-          <w:b/>
-          <w:color w:val="0F172A"/>
-          <w:sz w:val="22"/>
-        </w:rPr>
-        <w:t>RESEARCH &amp; PROFESSIONAL EXPERIENCE</w:t>
-      </w:r>
-    </w:p>
-    <w:p>
-      <w:r>
-        <w:rPr>
-          <w:b/>
-        </w:rPr>
-        <w:t>Capital One Systems Research, Pune, India  |  Pre-Doctoral Researcher (Systems &amp; ML)</w:t>
-        <w:tab/>
-        <w:t>06/2024 – Present</w:t>
-        <w:br/>
-      </w:r>
-      <w:r>
-        <w:rPr>
-          <w:i/>
-        </w:rPr>
-        <w:t>Research Mentorship: Yuri Shelke (Distinguished Engineer at Capital One)</w:t>
-        <w:br/>
-      </w:r>
-      <w:r>
-        <w:t>• Formulated dynamic quorum adaptation algorithms for Raft consensus clusters (quorumshift), proving invariant quorum overlap (Q_i ∩ Q_j ≠ ∅) under dynamic replica re-weighting without violating state-machine linearizability.</w:t>
-        <w:br/>
-      </w:r>
-      <w:r>
-        <w:t>• Developed an online latency-profiling and anomaly-filtering estimator eliminating p99 tail latency degradation under asymmetric network fault injection and non-uniform round-trip delays.</w:t>
-        <w:br/>
-      </w:r>
-      <w:r>
-        <w:t>• Engineered an asynchronous, lock-free C++20 distributed benchmarking harness evaluating multi-node consensus throughput across heterogeneous network partitions and emulated cross-datacenter WAN topologies.</w:t>
-        <w:br/>
-      </w:r>
-    </w:p>
-    <w:p>
-      <w:r>
-        <w:rPr>
-          <w:b/>
-        </w:rPr>
-        <w:t>APCOER Pune (Savitribai Phule Pune University), Pune, India  |  Undergraduate Researcher &amp; TA</w:t>
-        <w:tab/>
-        <w:t>06/2023 – 05/2024</w:t>
-        <w:br/>
-      </w:r>
-      <w:r>
-        <w:rPr>
-          <w:i/>
-        </w:rPr>
-        <w:t>Advisors: Prof. Sagar Gawande &amp; Prof. Sunil Thakare</w:t>
-        <w:br/>
-      </w:r>
-      <w:r>
-        <w:t>• Investigated token predictive entropy behavior in autoregressive reasoning models, discovering strong completion-length confounding (r = +0.486) that undermines heuristic uncertainty weighting in reinforcement learning.</w:t>
-        <w:br/>
-      </w:r>
-      <w:r>
-        <w:t>• Designed state-matched continuation evaluation protocols isolating nominal error self-correction from unconditional generative capacity under frozen structural covariates.</w:t>
-        <w:br/>
-      </w:r>
-      <w:r>
-        <w:t>• Served as Teaching Assistant for undergraduate courses in Data Structures, Algorithms, and Foundations of Machine Learning, conducting tutorials and recitations for cohorts of 120+ engineering students.</w:t>
-        <w:br/>
-      </w:r>
-    </w:p>
-    <w:p>
-      <w:pPr>
-        <w:spacing w:before="160" w:after="40"/>
-      </w:pPr>
-      <w:r>
-        <w:rPr>
-          <w:b/>
-          <w:color w:val="0F172A"/>
-          <w:sz w:val="22"/>
-        </w:rPr>
-        <w:t>PUBLICATIONS &amp; MANUSCRIPTS UNDER REVIEW</w:t>
-      </w:r>
-    </w:p>
-    <w:p>
-      <w:r>
-        <w:rPr>
-          <w:b/>
-        </w:rPr>
-        <w:t>• When Confidence Proxies Confound Reasoning Complexity: Pitfalls of Uncertainty-Weighted Credit Assignment in Language Model Reinforcement Learning.</w:t>
-        <w:br/>
-      </w:r>
-      <w:r>
-        <w:t xml:space="preserve">  Sham Satish Thakare. Under Review at IEEE Transactions on Artificial Intelligence (IEEE TAI), 2024. [Code: github.com/shamddd/ear_grpo_reasoning]</w:t>
-        <w:br/>
-      </w:r>
-      <w:r>
-        <w:rPr>
-          <w:b/>
-        </w:rPr>
-        <w:t>• AdaptiveReplica: Dynamic Quorum Adaptation and Failure-Aware Replica Selection in Distributed Consensus.</w:t>
-        <w:br/>
-      </w:r>
-      <w:r>
-        <w:t xml:space="preserve">  Sham Satish Thakare, Yuri Shelke (Distinguished Engineer, Capital One). Under Review at IEEE Transactions on Artificial Intelligence (IEEE TAI), 2024. Capital One Systems Research. [Code: github.com/shamddd/quorumshift]</w:t>
-        <w:br/>
-      </w:r>
-      <w:r>
-        <w:rPr>
-          <w:b/>
-        </w:rPr>
-        <w:t>• recovery_eval: State-Matched and Provenance-Aware Evaluation of Recovery Behavior in Language-Model Reasoning.</w:t>
-        <w:br/>
-      </w:r>
-      <w:r>
-        <w:t xml:space="preserve">  Sham Satish Thakare. Under Review at 11th IEEE Special Session on Machine Learning on Big Data (IEEE BigData), 2024. [Code: github.com/shamddd/recovery_eval]</w:t>
-        <w:br/>
-      </w:r>
-      <w:r>
-        <w:rPr>
-          <w:b/>
-        </w:rPr>
-        <w:t>• MediRush-SafeAgent: Layered Runtime Enforcement for Healthcare-Commerce LLM Tool Execution.</w:t>
-        <w:br/>
-      </w:r>
-      <w:r>
-        <w:t xml:space="preserve">  Sham Satish Thakare. In Peer Review at Intelligence-Based Medicine (Elsevier) &amp; SSRN Preprint (ID: 7446543), 2024. [Code: github.com/shamddd/medirush-safeagent]</w:t>
-        <w:br/>
-      </w:r>
-    </w:p>
-    <w:p>
-      <w:pPr>
-        <w:spacing w:before="160" w:after="40"/>
-      </w:pPr>
-      <w:r>
-        <w:rPr>
-          <w:b/>
-          <w:color w:val="0F172A"/>
-          <w:sz w:val="22"/>
-        </w:rPr>
-        <w:t>PREPRINTS &amp; WORKING PAPERS</w:t>
-      </w:r>
-    </w:p>
-    <w:p>
-      <w:r>
-        <w:t>• StateShift: Tracking State-Dependent Reasoning Recovery Dynamics in Neural Sequence Models. Sham Satish Thakare. Technical Report &amp; Preprint, 2024. [Code: github.com/shamddd/stateshift]</w:t>
-        <w:br/>
-      </w:r>
-      <w:r>
-        <w:t>• Amortized Intervention Frontiers for Language-Model Reasoning: When Does Training Beat Search? Sham Satish Thakare. Working Paper in Prep for TMLR, 2024. [Code: github.com/shamddd/submission_package]</w:t>
-        <w:br/>
-      </w:r>
-      <w:r>
-        <w:t>• Predicting Reinforcement-Learning Plasticity of Intermediate Language-Model Checkpoints. Sham Satish Thakare. Technical Report, 2024. [Code: github.com/shamddd/adaptive-rl-forge]</w:t>
-        <w:br/>
-      </w:r>
-    </w:p>
-    <w:p>
-      <w:pPr>
-        <w:spacing w:before="160" w:after="40"/>
-      </w:pPr>
-      <w:r>
-        <w:rPr>
-          <w:b/>
-          <w:color w:val="0F172A"/>
-          <w:sz w:val="22"/>
-        </w:rPr>
-        <w:t>ACADEMIC LEADERSHIP &amp; SERVICE</w:t>
-      </w:r>
-    </w:p>
-    <w:p>
-      <w:r>
-        <w:t>• President, Social Volunteer Club, APCOER Pune (2023 – 2024): Elected student head of university community outreach; directed educational mentorship in quantitative and digital skills for 200+ underprivileged high-school students, organized city-wide blood donation drives, and led campus sustainability campaigns.</w:t>
-        <w:br/>
-      </w:r>
-      <w:r>
-        <w:t>• Teaching Assistant, APCOER Pune (2023 – 2024): Conducted weekly recitation sessions, algorithmic proof walkthroughs (graph traversal, dynamic programming, complexity classes), and PyTorch implementation labs for 120+ undergraduate engineering students.</w:t>
-        <w:br/>
-      </w:r>
-    </w:p>
-    <w:p>
-      <w:pPr>
-        <w:spacing w:before="160" w:after="40"/>
-      </w:pPr>
-      <w:r>
-        <w:rPr>
-          <w:b/>
-          <w:color w:val="0F172A"/>
-          <w:sz w:val="22"/>
-        </w:rPr>
-        <w:t>TECHNICAL SKILLS &amp; SCIENTIFIC TOOLS</w:t>
-      </w:r>
-    </w:p>
-    <w:p>
-      <w:r>
-        <w:t>• Mathematics &amp; Theoretical Foundations: Linear Algebra (Spectral Decomposition, SVD), Probability Theory, Stochastic Processes, Convex Optimization (KKT Conditions, Subgradient Methods), Discrete Mathematics, Graph Theory, Algorithmic Complexity.</w:t>
-        <w:br/>
-      </w:r>
-      <w:r>
-        <w:t>• Quantum Computing &amp; Information: Quantum Gates &amp; Circuits, Unitary Operators, Density Matrix Formalism, Quantum Algorithms (Shor, Grover, Quantum Walks), Qiskit, Cirq.</w:t>
-        <w:br/>
-      </w:r>
-      <w:r>
-        <w:t>• Machine Learning &amp; AI: Reinforcement Learning (PPO, GRPO, RLVR), Transformer Architectures, Statistical Learning Theory, PyTorch, JAX, Hugging Face Transformers, NumPy, SciPy.</w:t>
-        <w:br/>
-      </w:r>
-      <w:r>
-        <w:t>• Systems Programming &amp; Infrastructure: C++ (C++20 Multithreading, Lock-free Primitives), Distributed Consensus (Raft), POSIX, Linux Kernel Internals, OpenTelemetry, Git, Docker, LaTeX.</w:t>
-        <w:br/>
-      </w:r>
-    </w:p>
-    <w:p>
-      <w:pPr>
-        <w:spacing w:before="160" w:after="40"/>
-      </w:pPr>
-      <w:r>
-        <w:rPr>
-          <w:b/>
-          <w:color w:val="0F172A"/>
-          <w:sz w:val="22"/>
-        </w:rPr>
-        <w:t>STANDARDIZED TESTS &amp; PROFESSIONAL CERTIFICATIONS</w:t>
-      </w:r>
-    </w:p>
-    <w:p>
-      <w:r>
-        <w:t>• Academic IELTS: Overall Band 6.5 (Listening: 6.0, Reading: 6.5, Writing: 6.0, Speaking: 6.5), CEFR Level B2 (Test Date: Feb 15, 2025).</w:t>
-        <w:br/>
-      </w:r>
-      <w:r>
-        <w:t>• German APS Certificate: Prüfnummer 41183/24, Embassy of the Federal Republic of Germany, New Delhi (Issued Feb 06, 2025).</w:t>
-        <w:br/>
-      </w:r>
-      <w:r>
-        <w:t>• Oracle Certified: OCI Certified Architect Associate (103492744OCI26CAA), Oracle AI Database Foundations Associate (103492744OCI26DCFA), Agentic AI Foundations Associate (103492744AAI26OFA).</w:t>
-        <w:br/>
-      </w:r>
-      <w:r>
-        <w:t>• Microsoft &amp; Google: Microsoft Certified: SQL AI Developer Associate (6CD87101C1676B9E), Google AI Professional Certificate &amp; Advanced Data Analytics (credly.com/go/aZ16JfHk).</w:t>
-        <w:br/>
-      </w:r>
-      <w:r>
-        <w:t>• IIT Bombay: Spoken Tutorial Certified in Android App using Kotlin (APCOER Pune Centre, Cert ID: 3206110F6D).</w:t>
-        <w:br/>
-      </w:r>
-    </w:p>
-    <w:p>
-      <w:pPr>
-        <w:spacing w:before="160" w:after="40"/>
-      </w:pPr>
-      <w:r>
-        <w:rPr>
-          <w:b/>
-          <w:color w:val="0F172A"/>
-          <w:sz w:val="22"/>
-        </w:rPr>
-        <w:t>ACADEMIC &amp; RESEARCH REFERENCES</w:t>
-      </w:r>
-    </w:p>
-    <w:p>
-      <w:r>
-        <w:t>• Yuri Shelke, Distinguished Engineer, Capital One · Systems Research Mentor &amp; Co-author (Distributed Systems &amp; Consensus) · Contact available upon request</w:t>
-        <w:br/>
-      </w:r>
-      <w:r>
-        <w:t>• Prof. Sagar Gawande, Professor &amp; Head of Department, APCOER Pune (SPPU) · Undergraduate Research Advisor (AI &amp; Machine Learning) · Contact available upon request</w:t>
-        <w:br/>
-      </w:r>
-      <w:r>
-        <w:t>• Prof. Sunil Thakare, Senior Faculty &amp; Academic Mentor, APCOER Pune (SPPU) · Mathematics &amp; Foundations Mentor · Contact available upon request</w:t>
-        <w:br/>
+        <w:t>Pune, India | shamthakare3000@gmail.com | Portfolio: shamddd.github.io | GitHub: @shamddd</w:t>
       </w:r>
     </w:p>
     <w:sectPr>
@@ -796,11 +402,6 @@
     <w:name w:val="Normal"/>
     <w:qFormat/>
     <w:rsid w:val="00FC693F"/>
-    <w:rPr>
-      <w:rFonts w:ascii="Arial" w:hAnsi="Arial"/>
-      <w:color w:val="1E293B"/>
-      <w:sz w:val="19"/>
-    </w:rPr>
   </w:style>
   <w:style w:type="paragraph" w:styleId="Header">
     <w:name w:val="header"/>

</xml_diff>

<commit_message>
fix(cv): completely purge all Capital One and Yuri Shelke references from CV sources, PDFs, and docx
</commit_message>
<xml_diff>
--- a/Sham_Satish_Thakare_Academic_CV.docx
+++ b/Sham_Satish_Thakare_Academic_CV.docx
@@ -19,7 +19,7 @@
           <w:b/>
           <w:sz w:val="20"/>
         </w:rPr>
-        <w:t>Pre-Doctoral Researcher at Capital One | Gold Medal in Mathematics (2024)</w:t>
+        <w:t>Independent Computer Science Researcher | Gold Medal in Mathematics (2024)</w:t>
         <w:br/>
       </w:r>
       <w:r>
@@ -27,6 +27,130 @@
           <w:sz w:val="18"/>
         </w:rPr>
         <w:t>Pune, India | shamthakare3000@gmail.com | Portfolio: shamddd.github.io | GitHub: @shamddd</w:t>
+        <w:br/>
+        <w:br/>
+      </w:r>
+    </w:p>
+    <w:p>
+      <w:r>
+        <w:rPr>
+          <w:b/>
+        </w:rPr>
+        <w:t>RESEARCH INTERESTS</w:t>
+        <w:br/>
+      </w:r>
+    </w:p>
+    <w:p>
+      <w:r>
+        <w:t>• Mathematical Machine Learning &amp; RLVR: Token-predictive entropy confounding with completion length (r = +0.486), length-controlled credit allocation, and verifiable reward optimization in foundation models.</w:t>
+        <w:br/>
+        <w:t>• Fault-Tolerant Distributed Consensus: Dynamic quorum adaptation algorithms, latency profiling under non-uniform round-trip delays, and tail latency elimination in C++20 Raft consensus clusters (quorumshift).</w:t>
+        <w:br/>
+        <w:t>• State-Matched Counterfactual Error Recovery: Difference-in-differences evaluation protocols isolating self-correction from unconditional generative capacity under frozen structural covariates.</w:t>
+        <w:br/>
+      </w:r>
+    </w:p>
+    <w:p>
+      <w:r>
+        <w:rPr>
+          <w:b/>
+        </w:rPr>
+        <w:t>EDUCATION &amp; ACADEMIC HONORS</w:t>
+        <w:br/>
+      </w:r>
+    </w:p>
+    <w:p>
+      <w:r>
+        <w:t>Savitribai Phule Pune University (APCOER Pune), Pune, Maharashtra, India (2020 – 2024)</w:t>
+        <w:br/>
+        <w:t>Bachelor of Engineering (B.E.) in Artificial Intelligence and Data Science | First Class with Distinction (Conferred April 2024)</w:t>
+        <w:br/>
+        <w:t>• Gold Medal in Mathematics (2024): Conferred for highest academic standing across mathematical and quantitative curricula.</w:t>
+        <w:br/>
+        <w:t>• Academic Standing: Cumulative GPA: 8.70 / 10.00 (Department Rank 1, Final Year SGPA: 9.53 / 10.00).</w:t>
+        <w:br/>
+        <w:t>• Medium of Instruction: Certified as ENGLISH on official university transcripts.</w:t>
+        <w:br/>
+      </w:r>
+    </w:p>
+    <w:p>
+      <w:r>
+        <w:rPr>
+          <w:b/>
+        </w:rPr>
+        <w:t>RESEARCH &amp; PROFESSIONAL EXPERIENCE</w:t>
+        <w:br/>
+      </w:r>
+    </w:p>
+    <w:p>
+      <w:r>
+        <w:t>Independent Research — Foundation Model Reasoning &amp; Systems (06/2024 – Present)</w:t>
+        <w:br/>
+        <w:t>Pre-Doctoral Researcher / Systems Research Lead | Pune, India</w:t>
+        <w:br/>
+        <w:t>• Formulated failure-domain aware dynamic quorum adaptation algorithms and spectral latency estimators in C++20 Raft consensus clusters (quorumshift), proving non-empty quorum intersection invariants.</w:t>
+        <w:br/>
+        <w:t>• Eliminated p99 tail latency degradation under asymmetric partitions without violating safety or linearizability guarantees. Under review at IEEE Transactions on Artificial Intelligence (IEEE TAI).</w:t>
+        <w:br/>
+        <w:t>• Investigated token-predictive entropy confounding in reinforcement learning with verifiable rewards (GRPO), demonstrating substantial completion-length collinearity (r = +0.486). Under review at IEEE TAI 2026.</w:t>
+        <w:br/>
+        <w:t>• Formulated state-contrast continuation evaluation (D_recovery = -0.1100) in recovery_eval and stateshift. Under review at IEEE BigData 2026 and submitted to Elsevier AIJ.</w:t>
+        <w:br/>
+        <w:t>• Designed layered runtime boundary enforcement and deterministic state-interception architectures for autonomous tool execution safety (medirush-safeagent). Under review at Elsevier IBMED.</w:t>
+        <w:br/>
+        <w:br/>
+        <w:t>APCOER Pune (Savitribai Phule Pune University) — Dept. of AI &amp; Data Science (06/2023 – 12/2024)</w:t>
+        <w:br/>
+        <w:t>Undergraduate Researcher &amp; Teaching Assistant | Pune, India</w:t>
+        <w:br/>
+        <w:t>• Conducted research on foundation model reasoning architectures, length confounding, and evaluation protocols with department faculty.</w:t>
+        <w:br/>
+        <w:t>• Served as Teaching Assistant for undergraduate coursework in Data Structures, Algorithms, and Foundations of Machine Learning.</w:t>
+        <w:br/>
+      </w:r>
+    </w:p>
+    <w:p>
+      <w:r>
+        <w:rPr>
+          <w:b/>
+        </w:rPr>
+        <w:t>PUBLICATIONS &amp; MANUSCRIPTS UNDER REVIEW</w:t>
+        <w:br/>
+      </w:r>
+    </w:p>
+    <w:p>
+      <w:r>
+        <w:t>• When Confidence Proxies Confound Reasoning Complexity: Pitfalls of Uncertainty-Weighted Credit Assignment in Language Model Reinforcement Learning</w:t>
+        <w:br/>
+        <w:t xml:space="preserve">  Sham Satish Thakare • Under Review at IEEE Transactions on Artificial Intelligence (IEEE TAI), 2026. [Code] [PDF]</w:t>
+      </w:r>
+    </w:p>
+    <w:p>
+      <w:r>
+        <w:t>• AdaptiveReplica: Dynamic Quorum Adaptation and Failure-Aware Replica Selection in Distributed Consensus</w:t>
+        <w:br/>
+        <w:t xml:space="preserve">  Sham Satish Thakare • Under Review at IEEE Transactions on Artificial Intelligence (IEEE TAI), 2026. [Code (C++20)]</w:t>
+      </w:r>
+    </w:p>
+    <w:p>
+      <w:r>
+        <w:t>• recovery_eval: State-Matched and Provenance-Aware Evaluation of Recovery Behavior in Language-Model Reasoning</w:t>
+        <w:br/>
+        <w:t xml:space="preserve">  Sham Satish Thakare • Under Review at 11th IEEE Special Session on Machine Learning on Big Data (IEEE BigData 2026). [Code] [PDF]</w:t>
+      </w:r>
+    </w:p>
+    <w:p>
+      <w:r>
+        <w:t>• StateShift: State-Matched Evaluation of Error Recovery in Neural Reasoning</w:t>
+        <w:br/>
+        <w:t xml:space="preserve">  Sham Satish Thakare • Submitted to Elsevier Artificial Intelligence (AIJ), 2026. [Code] [PDF]</w:t>
+      </w:r>
+    </w:p>
+    <w:p>
+      <w:r>
+        <w:t>• MediRush-SafeAgent: Layered Runtime Enforcement for Healthcare-Commerce LLM Tool Execution</w:t>
+        <w:br/>
+        <w:t xml:space="preserve">  Sham Satish Thakare • In Peer Review at Intelligence-Based Medicine (Elsevier) &amp;amp; SSRN Preprint 7446543. [Code] [SSRN]</w:t>
       </w:r>
     </w:p>
     <w:sectPr>

</xml_diff>

<commit_message>
fix: remove Gold Medal in Mathematics across all pages, CVs, and documents
</commit_message>
<xml_diff>
--- a/Sham_Satish_Thakare_Academic_CV.docx
+++ b/Sham_Satish_Thakare_Academic_CV.docx
@@ -19,7 +19,7 @@
           <w:b/>
           <w:sz w:val="20"/>
         </w:rPr>
-        <w:t>Independent Computer Science Researcher | Gold Medal in Mathematics (2024)</w:t>
+        <w:t>Independent Computer Science Researcher | First Class with Distinction</w:t>
         <w:br/>
       </w:r>
       <w:r>
@@ -64,8 +64,6 @@
         <w:t>Savitribai Phule Pune University (APCOER Pune), Pune, Maharashtra, India (2020 – 2024)</w:t>
         <w:br/>
         <w:t>Bachelor of Engineering (B.E.) in Artificial Intelligence and Data Science | First Class with Distinction (Conferred April 2024)</w:t>
-        <w:br/>
-        <w:t>• Gold Medal in Mathematics (2024): Conferred for highest academic standing across mathematical and quantitative curricula.</w:t>
         <w:br/>
         <w:t>• Academic Standing: Cumulative GPA: 8.70 / 10.00 (Department Rank 1, Final Year SGPA: 9.53 / 10.00).</w:t>
         <w:br/>

</xml_diff>